<commit_message>
Toán 11 CĐ2 Bài 9: sửa kí hiệu bậc trong lời giải Bài 2.12 (bổ sung)
Co-Authored-By: Claude Opus 5.5 <noreply@anthropic.com>
</commit_message>
<xml_diff>
--- a/mon/toan/khbd/lop11/KHBD_TOAN11_CD2_Bai9_EulerHamilton_T18-20.docx
+++ b/mon/toan/khbd/lop11/KHBD_TOAN11_CD2_Bai9_EulerHamilton_T18-20.docx
@@ -6193,22 +6193,7 @@
       </w:r>
       <m:oMath>
         <m:r>
-          <m:rPr>
-            <m:sty m:val="p"/>
-          </m:rPr>
-          <m:t>deg</m:t>
-        </m:r>
-        <m:r>
-          <m:t>u+</m:t>
-        </m:r>
-        <m:r>
-          <m:rPr>
-            <m:sty m:val="p"/>
-          </m:rPr>
-          <m:t>deg</m:t>
-        </m:r>
-        <m:r>
-          <m:t>v≥</m:t>
+          <m:t>d(u)+d(v)≥</m:t>
         </m:r>
         <m:f>
           <m:fPr>

</xml_diff>